<commit_message>
Documentación actualizada al despliegue en Hetzner Cloud
</commit_message>
<xml_diff>
--- a/docs/Informe_seguimiento_hito50_Diego_Perez_Fonterosa.docx
+++ b/docs/Informe_seguimiento_hito50_Diego_Perez_Fonterosa.docx
@@ -121,7 +121,7 @@
           <w:sz w:val="24"/>
           <w:szCs w:val="24"/>
         </w:rPr>
-        <w:t xml:space="preserve">El proyecto ha completado aproximadamente el 59 % del esfuerzo estimado (64 de 109 horas), por encima del 28 % que la planificación preveía para esta fecha. La diferencia se debe a que se han adelantado trabajos de las fases de análisis, informe y memoria mientras se resolvía un bloqueo en la fase de despliegue.</w:t>
+        <w:t xml:space="preserve">El proyecto ha completado aproximadamente el 64 % del esfuerzo estimado (70 de 109 horas), por encima del 28 % que la planificación preveía para esta fecha. La diferencia se debe a que se adelantaron trabajos de las fases de análisis, informe y memoria mientras se resolvía un bloqueo en la fase de despliegue.</w:t>
       </w:r>
     </w:p>
     <w:p>
@@ -136,7 +136,7 @@
           <w:sz w:val="24"/>
           <w:szCs w:val="24"/>
         </w:rPr>
-        <w:t xml:space="preserve">Ese bloqueo es el punto crítico del proyecto: Oracle Cloud no tiene capacidad disponible para la instancia gratuita prevista en la región de Madrid, de modo que el honeypot todavía no está expuesto a Internet. Todo lo necesario para desplegarlo está preparado y probado, y hay un mecanismo automático buscando la instancia de forma continua. El plan incluye una fecha límite para recurrir a una alternativa si el bloqueo persiste.</w:t>
+        <w:t xml:space="preserve">Ese bloqueo ya está resuelto: Oracle Cloud no tuvo capacidad para la instancia gratuita prevista, y el servidor se ha desplegado en Hetzner Cloud. Está bastionado (SSH de administración en el puerto 2022 solo con clave, sin acceso como root y con cortafuegos activo), y en los próximos días se instalará Cowrie y comenzará la captura, antes de la fecha planificada.</w:t>
       </w:r>
     </w:p>
     <w:p>
@@ -462,49 +462,49 @@
                 <w:sz w:val="20"/>
                 <w:szCs w:val="20"/>
               </w:rPr>
-              <w:t xml:space="preserve">6</w:t>
-            </w:r>
-          </w:p>
-        </w:tc>
-        <w:tc>
-          <w:tcPr>
-            <w:vAlign w:val="center"/>
-          </w:tcPr>
-          <w:p>
-            <w:pPr>
-              <w:spacing w:line="276"/>
-              <w:jc w:val="center"/>
-            </w:pPr>
-            <w:r>
-              <w:rPr>
-                <w:rFonts w:ascii="Arial" w:cs="Arial" w:eastAsia="Arial" w:hAnsi="Arial"/>
-                <w:b w:val="false"/>
-                <w:bCs w:val="false"/>
-                <w:sz w:val="20"/>
-                <w:szCs w:val="20"/>
-              </w:rPr>
-              <w:t xml:space="preserve">60 %</w:t>
-            </w:r>
-          </w:p>
-        </w:tc>
-        <w:tc>
-          <w:tcPr>
-            <w:vAlign w:val="center"/>
-          </w:tcPr>
-          <w:p>
-            <w:pPr>
-              <w:spacing w:line="276"/>
-              <w:jc w:val="left"/>
-            </w:pPr>
-            <w:r>
-              <w:rPr>
-                <w:rFonts w:ascii="Arial" w:cs="Arial" w:eastAsia="Arial" w:hAnsi="Arial"/>
-                <w:b w:val="false"/>
-                <w:bCs w:val="false"/>
-                <w:sz w:val="20"/>
-                <w:szCs w:val="20"/>
-              </w:rPr>
-              <w:t xml:space="preserve">Bloqueada por capacidad de OCI; script de reintento en marcha</w:t>
+              <w:t xml:space="preserve">10</w:t>
+            </w:r>
+          </w:p>
+        </w:tc>
+        <w:tc>
+          <w:tcPr>
+            <w:vAlign w:val="center"/>
+          </w:tcPr>
+          <w:p>
+            <w:pPr>
+              <w:spacing w:line="276"/>
+              <w:jc w:val="center"/>
+            </w:pPr>
+            <w:r>
+              <w:rPr>
+                <w:rFonts w:ascii="Arial" w:cs="Arial" w:eastAsia="Arial" w:hAnsi="Arial"/>
+                <w:b w:val="false"/>
+                <w:bCs w:val="false"/>
+                <w:sz w:val="20"/>
+                <w:szCs w:val="20"/>
+              </w:rPr>
+              <w:t xml:space="preserve">100 %</w:t>
+            </w:r>
+          </w:p>
+        </w:tc>
+        <w:tc>
+          <w:tcPr>
+            <w:vAlign w:val="center"/>
+          </w:tcPr>
+          <w:p>
+            <w:pPr>
+              <w:spacing w:line="276"/>
+              <w:jc w:val="left"/>
+            </w:pPr>
+            <w:r>
+              <w:rPr>
+                <w:rFonts w:ascii="Arial" w:cs="Arial" w:eastAsia="Arial" w:hAnsi="Arial"/>
+                <w:b w:val="false"/>
+                <w:bCs w:val="false"/>
+                <w:sz w:val="20"/>
+                <w:szCs w:val="20"/>
+              </w:rPr>
+              <w:t xml:space="preserve">Servidor desplegado en Hetzner Cloud (Oracle sin capacidad)</w:t>
             </w:r>
           </w:p>
         </w:tc>
@@ -569,49 +569,49 @@
                 <w:sz w:val="20"/>
                 <w:szCs w:val="20"/>
               </w:rPr>
-              <w:t xml:space="preserve">5</w:t>
-            </w:r>
-          </w:p>
-        </w:tc>
-        <w:tc>
-          <w:tcPr>
-            <w:vAlign w:val="center"/>
-          </w:tcPr>
-          <w:p>
-            <w:pPr>
-              <w:spacing w:line="276"/>
-              <w:jc w:val="center"/>
-            </w:pPr>
-            <w:r>
-              <w:rPr>
-                <w:rFonts w:ascii="Arial" w:cs="Arial" w:eastAsia="Arial" w:hAnsi="Arial"/>
-                <w:b w:val="false"/>
-                <w:bCs w:val="false"/>
-                <w:sz w:val="20"/>
-                <w:szCs w:val="20"/>
-              </w:rPr>
-              <w:t xml:space="preserve">65 %</w:t>
-            </w:r>
-          </w:p>
-        </w:tc>
-        <w:tc>
-          <w:tcPr>
-            <w:vAlign w:val="center"/>
-          </w:tcPr>
-          <w:p>
-            <w:pPr>
-              <w:spacing w:line="276"/>
-              <w:jc w:val="left"/>
-            </w:pPr>
-            <w:r>
-              <w:rPr>
-                <w:rFonts w:ascii="Arial" w:cs="Arial" w:eastAsia="Arial" w:hAnsi="Arial"/>
-                <w:b w:val="false"/>
-                <w:bCs w:val="false"/>
-                <w:sz w:val="20"/>
-                <w:szCs w:val="20"/>
-              </w:rPr>
-              <w:t xml:space="preserve">Script listo y validado; falta ejecutarlo en el servidor</w:t>
+              <w:t xml:space="preserve">7</w:t>
+            </w:r>
+          </w:p>
+        </w:tc>
+        <w:tc>
+          <w:tcPr>
+            <w:vAlign w:val="center"/>
+          </w:tcPr>
+          <w:p>
+            <w:pPr>
+              <w:spacing w:line="276"/>
+              <w:jc w:val="center"/>
+            </w:pPr>
+            <w:r>
+              <w:rPr>
+                <w:rFonts w:ascii="Arial" w:cs="Arial" w:eastAsia="Arial" w:hAnsi="Arial"/>
+                <w:b w:val="false"/>
+                <w:bCs w:val="false"/>
+                <w:sz w:val="20"/>
+                <w:szCs w:val="20"/>
+              </w:rPr>
+              <w:t xml:space="preserve">85 %</w:t>
+            </w:r>
+          </w:p>
+        </w:tc>
+        <w:tc>
+          <w:tcPr>
+            <w:vAlign w:val="center"/>
+          </w:tcPr>
+          <w:p>
+            <w:pPr>
+              <w:spacing w:line="276"/>
+              <w:jc w:val="left"/>
+            </w:pPr>
+            <w:r>
+              <w:rPr>
+                <w:rFonts w:ascii="Arial" w:cs="Arial" w:eastAsia="Arial" w:hAnsi="Arial"/>
+                <w:b w:val="false"/>
+                <w:bCs w:val="false"/>
+                <w:sz w:val="20"/>
+                <w:szCs w:val="20"/>
+              </w:rPr>
+              <w:t xml:space="preserve">Aplicado en el servidor; faltan las pruebas de reinicio y nmap</w:t>
             </w:r>
           </w:p>
         </w:tc>
@@ -718,7 +718,7 @@
                 <w:sz w:val="20"/>
                 <w:szCs w:val="20"/>
               </w:rPr>
-              <w:t xml:space="preserve">Instalación y configuración probadas en local; falta el servidor</w:t>
+              <w:t xml:space="preserve">Instalación probada en local; falta ejecutarla en el servidor</w:t>
             </w:r>
           </w:p>
         </w:tc>
@@ -1146,7 +1146,7 @@
                 <w:sz w:val="20"/>
                 <w:szCs w:val="20"/>
               </w:rPr>
-              <w:t xml:space="preserve">66 páginas de borrador; faltan los capítulos de resultados</w:t>
+              <w:t xml:space="preserve">69 páginas de borrador; faltan los capítulos de resultados</w:t>
             </w:r>
           </w:p>
         </w:tc>
@@ -1214,7 +1214,7 @@
                 <w:sz w:val="20"/>
                 <w:szCs w:val="20"/>
               </w:rPr>
-              <w:t xml:space="preserve">≈ 64</w:t>
+              <w:t xml:space="preserve">≈ 70</w:t>
             </w:r>
           </w:p>
         </w:tc>
@@ -1236,7 +1236,7 @@
                 <w:sz w:val="20"/>
                 <w:szCs w:val="20"/>
               </w:rPr>
-              <w:t xml:space="preserve">≈ 59 %</w:t>
+              <w:t xml:space="preserve">≈ 64 %</w:t>
             </w:r>
           </w:p>
         </w:tc>
@@ -1277,7 +1277,7 @@
           <w:sz w:val="24"/>
           <w:szCs w:val="24"/>
         </w:rPr>
-        <w:t xml:space="preserve">Tabla 1. Avance por fases (estimación de horas a 3 de octubre de 2026).</w:t>
+        <w:t xml:space="preserve">Tabla 1. Avance por fases (estimación de horas a 4 de octubre de 2026).</w:t>
       </w:r>
     </w:p>
     <w:p>
@@ -1315,7 +1315,7 @@
       <w:pPr>
         <w:spacing w:after="120" w:line="360"/>
       </w:pPr>
-      <w:hyperlink w:history="1" r:id="rIdfbra41b6lzhzuzi-zgfjm">
+      <w:hyperlink w:history="1" r:id="rIdopzxsa-d4awgux8uvl0qa">
         <w:r>
           <w:rPr>
             <w:rStyle w:val="Hyperlink"/>
@@ -1403,15 +1403,15 @@
           <w:sz w:val="24"/>
           <w:szCs w:val="24"/>
         </w:rPr>
-        <w:t xml:space="preserve">Aprovisionamiento (scripts/oci_a1_retry.py): </w:t>
-      </w:r>
-      <w:r>
-        <w:rPr>
-          <w:rFonts w:ascii="Arial" w:cs="Arial" w:eastAsia="Arial" w:hAnsi="Arial"/>
-          <w:sz w:val="24"/>
-          <w:szCs w:val="24"/>
-        </w:rPr>
-        <w:t xml:space="preserve">herramienta que solicita la instancia a la API de Oracle cada minuto y avisa al móvil cuando la consigue.</w:t>
+        <w:t xml:space="preserve">Servidor en Hetzner Cloud: </w:t>
+      </w:r>
+      <w:r>
+        <w:rPr>
+          <w:rFonts w:ascii="Arial" w:cs="Arial" w:eastAsia="Arial" w:hAnsi="Arial"/>
+          <w:sz w:val="24"/>
+          <w:szCs w:val="24"/>
+        </w:rPr>
+        <w:t xml:space="preserve">Ubuntu Server 24.04 en Núremberg, con cortafuegos del proveedor y bastionado aplicado con el primer script.</w:t>
       </w:r>
     </w:p>
     <w:p>
@@ -1440,7 +1440,7 @@
           <w:sz w:val="24"/>
           <w:szCs w:val="24"/>
         </w:rPr>
-        <w:t xml:space="preserve">memoria con la estructura de Prometeo (66 páginas de borrador), diagramas de arquitectura y de red, desglose RFTP y diagrama de Gantt.</w:t>
+        <w:t xml:space="preserve">memoria con la estructura de Prometeo (69 páginas de borrador), diagramas de arquitectura y de red, desglose RFTP y diagrama de Gantt.</w:t>
       </w:r>
     </w:p>
     <w:p>
@@ -1457,7 +1457,7 @@
           <w:sz w:val="24"/>
           <w:szCs w:val="24"/>
         </w:rPr>
-        <w:t xml:space="preserve">4. Incidencia: Capacidad en Oracle Cloud</w:t>
+        <w:t xml:space="preserve">4. Incidencia: Cambio de Plataforma Cloud</w:t>
       </w:r>
     </w:p>
     <w:p>
@@ -1472,7 +1472,7 @@
           <w:sz w:val="24"/>
           <w:szCs w:val="24"/>
         </w:rPr>
-        <w:t xml:space="preserve">Desde el inicio de la fase de despliegue, Oracle responde «Out of host capacity» a la creación de la instancia A1.Flex gratuita. Se valoraron tres alternativas:</w:t>
+        <w:t xml:space="preserve">Oracle respondió «Out of host capacity» a todas las solicitudes de la instancia A1.Flex gratuita. Para intentar obtenerla se desarrolló un script con el SDK oficial de Oracle que la solicitó cada minuto durante más de un día, con más de 600 intentos sin éxito. Se valoraron entonces las alternativas gratuitas:</w:t>
       </w:r>
     </w:p>
     <w:p>
@@ -1493,15 +1493,15 @@
           <w:sz w:val="24"/>
           <w:szCs w:val="24"/>
         </w:rPr>
-        <w:t xml:space="preserve">Instancia VM.Standard.E2.1.Micro: </w:t>
-      </w:r>
-      <w:r>
-        <w:rPr>
-          <w:rFonts w:ascii="Arial" w:cs="Arial" w:eastAsia="Arial" w:hAnsi="Arial"/>
-          <w:sz w:val="24"/>
-          <w:szCs w:val="24"/>
-        </w:rPr>
-        <w:t xml:space="preserve">también gratuita, pero no está disponible para la cuenta en la región.</w:t>
+        <w:t xml:space="preserve">Otra instancia gratuita de Oracle (E2.1.Micro): </w:t>
+      </w:r>
+      <w:r>
+        <w:rPr>
+          <w:rFonts w:ascii="Arial" w:cs="Arial" w:eastAsia="Arial" w:hAnsi="Arial"/>
+          <w:sz w:val="24"/>
+          <w:szCs w:val="24"/>
+        </w:rPr>
+        <w:t xml:space="preserve">no disponible para la cuenta en la región.</w:t>
       </w:r>
     </w:p>
     <w:p>
@@ -1522,15 +1522,15 @@
           <w:sz w:val="24"/>
           <w:szCs w:val="24"/>
         </w:rPr>
-        <w:t xml:space="preserve">Cuenta Pay As You Go: </w:t>
-      </w:r>
-      <w:r>
-        <w:rPr>
-          <w:rFonts w:ascii="Arial" w:cs="Arial" w:eastAsia="Arial" w:hAnsi="Arial"/>
-          <w:sz w:val="24"/>
-          <w:szCs w:val="24"/>
-        </w:rPr>
-        <w:t xml:space="preserve">descartada porque exige una retención temporal de unos 93 € en la tarjeta.</w:t>
+        <w:t xml:space="preserve">Azure for Students: </w:t>
+      </w:r>
+      <w:r>
+        <w:rPr>
+          <w:rFonts w:ascii="Arial" w:cs="Arial" w:eastAsia="Arial" w:hAnsi="Arial"/>
+          <w:sz w:val="24"/>
+          <w:szCs w:val="24"/>
+        </w:rPr>
+        <w:t xml:space="preserve">la verificación automática no reconoce el dominio de correo del centro.</w:t>
       </w:r>
     </w:p>
     <w:p>
@@ -1551,15 +1551,15 @@
           <w:sz w:val="24"/>
           <w:szCs w:val="24"/>
         </w:rPr>
-        <w:t xml:space="preserve">Creación automatizada por API: </w:t>
-      </w:r>
-      <w:r>
-        <w:rPr>
-          <w:rFonts w:ascii="Arial" w:cs="Arial" w:eastAsia="Arial" w:hAnsi="Arial"/>
-          <w:sz w:val="24"/>
-          <w:szCs w:val="24"/>
-        </w:rPr>
-        <w:t xml:space="preserve">opción elegida. Un script desarrollado con el SDK oficial de Oracle reintenta la creación cada minuto, gestiona los límites de peticiones y envía una notificación al conseguirla. Está en ejecución desde el 3 de octubre.</w:t>
+        <w:t xml:space="preserve">AWS: </w:t>
+      </w:r>
+      <w:r>
+        <w:rPr>
+          <w:rFonts w:ascii="Arial" w:cs="Arial" w:eastAsia="Arial" w:hAnsi="Arial"/>
+          <w:sz w:val="24"/>
+          <w:szCs w:val="24"/>
+        </w:rPr>
+        <w:t xml:space="preserve">el nuevo plan gratuito con crédito no aplica a cuentas creadas antes de julio de 2025.</w:t>
       </w:r>
     </w:p>
     <w:p>
@@ -1574,7 +1574,7 @@
           <w:sz w:val="24"/>
           <w:szCs w:val="24"/>
         </w:rPr>
-        <w:t xml:space="preserve">Durante este análisis se detectó un segundo riesgo: Oracle puede recuperar las instancias gratuitas que pasan 7 días con uso de CPU, red y memoria por debajo del 20 %, condiciones que un honeypot cumple. Se ha resuelto con un servicio que mantiene reservado el 25 % de la memoria, de modo que la instancia no se considere ociosa durante la captura.</w:t>
+        <w:t xml:space="preserve">Agotadas las opciones gratuitas, el servidor se desplegó en Hetzner Cloud el 4 de octubre. Como el despliegue está automatizado con scripts genéricos para Ubuntu 24.04, el cambio solo afectó a la creación de la máquina. Este cambio respecto al anteproyecto se ha comunicado por correo.</w:t>
       </w:r>
     </w:p>
     <w:p>
@@ -1649,7 +1649,36 @@
           <w:sz w:val="24"/>
           <w:szCs w:val="24"/>
         </w:rPr>
-        <w:t xml:space="preserve">las imágenes de Ubuntu de Oracle ya traen reglas de iptables, y UFW no permite crear la redirección de puertos con sus comandos. Usar una única herramienta evita conflictos.</w:t>
+        <w:t xml:space="preserve">UFW no permite crear la redirección de puertos con sus comandos, y dos herramientas sobre las mismas reglas generan conflictos. En el servidor real, al instalar iptables-persistent el sistema desinstaló UFW automáticamente por ser incompatibles.</w:t>
+      </w:r>
+    </w:p>
+    <w:p>
+      <w:pPr>
+        <w:pStyle w:val="ListParagraph"/>
+        <w:numPr>
+          <w:ilvl w:val="0"/>
+          <w:numId w:val="1"/>
+        </w:numPr>
+        <w:spacing w:line="360"/>
+        <w:ind w:left="720" w:hanging="357"/>
+      </w:pPr>
+      <w:r>
+        <w:rPr>
+          <w:rFonts w:ascii="Arial" w:cs="Arial" w:eastAsia="Arial" w:hAnsi="Arial"/>
+          <w:b/>
+          <w:bCs/>
+          <w:sz w:val="24"/>
+          <w:szCs w:val="24"/>
+        </w:rPr>
+        <w:t xml:space="preserve">Validación de sshd en Ubuntu 24.04: </w:t>
+      </w:r>
+      <w:r>
+        <w:rPr>
+          <w:rFonts w:ascii="Arial" w:cs="Arial" w:eastAsia="Arial" w:hAnsi="Arial"/>
+          <w:sz w:val="24"/>
+          <w:szCs w:val="24"/>
+        </w:rPr>
+        <w:t xml:space="preserve">en el despliegue real el script se detuvo de forma segura porque la validación de sshd exige un directorio que en Ubuntu 24.04 solo existe con el servicio en marcha. Se corrigió y el bastionado se completó sin riesgo para el acceso.</w:t>
       </w:r>
     </w:p>
     <w:p>
@@ -1783,28 +1812,28 @@
                 <w:sz w:val="20"/>
                 <w:szCs w:val="20"/>
               </w:rPr>
-              <w:t xml:space="preserve">Hasta obtener la instancia</w:t>
-            </w:r>
-          </w:p>
-        </w:tc>
-        <w:tc>
-          <w:tcPr>
-            <w:vAlign w:val="center"/>
-          </w:tcPr>
-          <w:p>
-            <w:pPr>
-              <w:spacing w:line="276"/>
-              <w:jc w:val="left"/>
-            </w:pPr>
-            <w:r>
-              <w:rPr>
-                <w:rFonts w:ascii="Arial" w:cs="Arial" w:eastAsia="Arial" w:hAnsi="Arial"/>
-                <w:b w:val="false"/>
-                <w:bCs w:val="false"/>
-                <w:sz w:val="20"/>
-                <w:szCs w:val="20"/>
-              </w:rPr>
-              <w:t xml:space="preserve">Script de reintento en ejecución continua, con aviso al móvil</w:t>
+              <w:t xml:space="preserve">Próximos días</w:t>
+            </w:r>
+          </w:p>
+        </w:tc>
+        <w:tc>
+          <w:tcPr>
+            <w:vAlign w:val="center"/>
+          </w:tcPr>
+          <w:p>
+            <w:pPr>
+              <w:spacing w:line="276"/>
+              <w:jc w:val="left"/>
+            </w:pPr>
+            <w:r>
+              <w:rPr>
+                <w:rFonts w:ascii="Arial" w:cs="Arial" w:eastAsia="Arial" w:hAnsi="Arial"/>
+                <w:b w:val="false"/>
+                <w:bCs w:val="false"/>
+                <w:sz w:val="20"/>
+                <w:szCs w:val="20"/>
+              </w:rPr>
+              <w:t xml:space="preserve">Instalación de Cowrie en el servidor y exposición del puerto 22 (scripts ya probados)</w:t>
             </w:r>
           </w:p>
         </w:tc>
@@ -1827,116 +1856,28 @@
                 <w:sz w:val="20"/>
                 <w:szCs w:val="20"/>
               </w:rPr>
-              <w:t xml:space="preserve">Día de la instancia</w:t>
-            </w:r>
-          </w:p>
-        </w:tc>
-        <w:tc>
-          <w:tcPr>
-            <w:vAlign w:val="center"/>
-          </w:tcPr>
-          <w:p>
-            <w:pPr>
-              <w:spacing w:line="276"/>
-              <w:jc w:val="left"/>
-            </w:pPr>
-            <w:r>
-              <w:rPr>
-                <w:rFonts w:ascii="Arial" w:cs="Arial" w:eastAsia="Arial" w:hAnsi="Arial"/>
-                <w:b w:val="false"/>
-                <w:bCs w:val="false"/>
-                <w:sz w:val="20"/>
-                <w:szCs w:val="20"/>
-              </w:rPr>
-              <w:t xml:space="preserve">Bastionado, instalación de Cowrie y exposición (≈ 1 hora con los scripts)</w:t>
-            </w:r>
-          </w:p>
-        </w:tc>
-      </w:tr>
-      <w:tr>
-        <w:tc>
-          <w:tcPr>
-            <w:vAlign w:val="center"/>
-          </w:tcPr>
-          <w:p>
-            <w:pPr>
-              <w:spacing w:line="276"/>
-              <w:jc w:val="left"/>
-            </w:pPr>
-            <w:r>
-              <w:rPr>
-                <w:rFonts w:ascii="Arial" w:cs="Arial" w:eastAsia="Arial" w:hAnsi="Arial"/>
-                <w:b w:val="false"/>
-                <w:bCs w:val="false"/>
-                <w:sz w:val="20"/>
-                <w:szCs w:val="20"/>
-              </w:rPr>
-              <w:t xml:space="preserve">Día siguiente</w:t>
-            </w:r>
-          </w:p>
-        </w:tc>
-        <w:tc>
-          <w:tcPr>
-            <w:vAlign w:val="center"/>
-          </w:tcPr>
-          <w:p>
-            <w:pPr>
-              <w:spacing w:line="276"/>
-              <w:jc w:val="left"/>
-            </w:pPr>
-            <w:r>
-              <w:rPr>
-                <w:rFonts w:ascii="Arial" w:cs="Arial" w:eastAsia="Arial" w:hAnsi="Arial"/>
-                <w:b w:val="false"/>
-                <w:bCs w:val="false"/>
-                <w:sz w:val="20"/>
-                <w:szCs w:val="20"/>
-              </w:rPr>
-              <w:t xml:space="preserve">Pruebas en el servidor: nmap externo, ataque controlado desde Kali, capturas para la memoria</w:t>
-            </w:r>
-          </w:p>
-        </w:tc>
-      </w:tr>
-      <w:tr>
-        <w:tc>
-          <w:tcPr>
-            <w:vAlign w:val="center"/>
-          </w:tcPr>
-          <w:p>
-            <w:pPr>
-              <w:spacing w:line="276"/>
-              <w:jc w:val="left"/>
-            </w:pPr>
-            <w:r>
-              <w:rPr>
-                <w:rFonts w:ascii="Arial" w:cs="Arial" w:eastAsia="Arial" w:hAnsi="Arial"/>
-                <w:b w:val="false"/>
-                <w:bCs w:val="false"/>
-                <w:sz w:val="20"/>
-                <w:szCs w:val="20"/>
-              </w:rPr>
-              <w:t xml:space="preserve">12 de octubre</w:t>
-            </w:r>
-          </w:p>
-        </w:tc>
-        <w:tc>
-          <w:tcPr>
-            <w:vAlign w:val="center"/>
-          </w:tcPr>
-          <w:p>
-            <w:pPr>
-              <w:spacing w:line="276"/>
-              <w:jc w:val="left"/>
-            </w:pPr>
-            <w:r>
-              <w:rPr>
-                <w:rFonts w:ascii="Arial" w:cs="Arial" w:eastAsia="Arial" w:hAnsi="Arial"/>
-                <w:b w:val="false"/>
-                <w:bCs w:val="false"/>
-                <w:sz w:val="20"/>
-                <w:szCs w:val="20"/>
-              </w:rPr>
-              <w:t xml:space="preserve">Fecha límite: si no hay instancia, se activa el plan alternativo (otro proveedor)</w:t>
+              <w:t xml:space="preserve">A continuación</w:t>
+            </w:r>
+          </w:p>
+        </w:tc>
+        <w:tc>
+          <w:tcPr>
+            <w:vAlign w:val="center"/>
+          </w:tcPr>
+          <w:p>
+            <w:pPr>
+              <w:spacing w:line="276"/>
+              <w:jc w:val="left"/>
+            </w:pPr>
+            <w:r>
+              <w:rPr>
+                <w:rFonts w:ascii="Arial" w:cs="Arial" w:eastAsia="Arial" w:hAnsi="Arial"/>
+                <w:b w:val="false"/>
+                <w:bCs w:val="false"/>
+                <w:sz w:val="20"/>
+                <w:szCs w:val="20"/>
+              </w:rPr>
+              <w:t xml:space="preserve">Pruebas en el servidor: reinicio, nmap externo, ataque controlado desde Kali y capturas</w:t>
             </w:r>
           </w:p>
         </w:tc>
@@ -2102,7 +2043,7 @@
           <w:sz w:val="24"/>
           <w:szCs w:val="24"/>
         </w:rPr>
-        <w:t xml:space="preserve">La captura necesita al menos tres semanas. Si comienza antes del 20 de octubre, el calendario original se mantiene sin cambios en las fases posteriores. El plan alternativo consiste en desplegar los mismos scripts en otro proveedor con capa gratuita o de bajo coste; al estar el despliegue automatizado, el cambio de proveedor solo afecta a la creación de la máquina.</w:t>
+        <w:t xml:space="preserve">La captura necesita al menos tres semanas. Al poder comenzar en los primeros días de octubre, antes del 14 de octubre previsto, el calendario de las fases posteriores se mantiene con margen.</w:t>
       </w:r>
     </w:p>
     <w:sectPr>

</xml_diff>

<commit_message>
Cowrie operativo en el puerto 22: captura iniciada
</commit_message>
<xml_diff>
--- a/docs/Informe_seguimiento_hito50_Diego_Perez_Fonterosa.docx
+++ b/docs/Informe_seguimiento_hito50_Diego_Perez_Fonterosa.docx
@@ -121,7 +121,7 @@
           <w:sz w:val="24"/>
           <w:szCs w:val="24"/>
         </w:rPr>
-        <w:t xml:space="preserve">El proyecto ha completado aproximadamente el 64 % del esfuerzo estimado (70 de 109 horas), por encima del 28 % que la planificación preveía para esta fecha. La diferencia se debe a que se adelantaron trabajos de las fases de análisis, informe y memoria mientras se resolvía un bloqueo en la fase de despliegue.</w:t>
+        <w:t xml:space="preserve">El proyecto ha completado aproximadamente el 69 % del esfuerzo estimado (75 de 109 horas), por encima del 28 % que la planificación preveía para esta fecha. La diferencia se debe a que se adelantaron trabajos de las fases de análisis, informe y memoria mientras se resolvía un bloqueo en la fase de despliegue.</w:t>
       </w:r>
     </w:p>
     <w:p>
@@ -136,7 +136,7 @@
           <w:sz w:val="24"/>
           <w:szCs w:val="24"/>
         </w:rPr>
-        <w:t xml:space="preserve">Ese bloqueo ya está resuelto: Oracle Cloud no tuvo capacidad para la instancia gratuita prevista, y el servidor se ha desplegado en Hetzner Cloud. Está bastionado (SSH de administración en el puerto 2022 solo con clave, sin acceso como root y con cortafuegos activo), y en los próximos días se instalará Cowrie y comenzará la captura, antes de la fecha planificada.</w:t>
+        <w:t xml:space="preserve">Ese bloqueo ya está resuelto: Oracle Cloud no tuvo capacidad para la instancia gratuita prevista, y el servidor se ha desplegado en Hetzner Cloud. Está bastionado (SSH de administración en el puerto 2022 solo con clave, sin acceso como root y con cortafuegos activo), y el 4 de octubre se instaló Cowrie y se expuso el puerto 22: la captura de ataques reales ya está en marcha, diez días antes de lo planificado.</w:t>
       </w:r>
     </w:p>
     <w:p>
@@ -569,49 +569,49 @@
                 <w:sz w:val="20"/>
                 <w:szCs w:val="20"/>
               </w:rPr>
-              <w:t xml:space="preserve">7</w:t>
-            </w:r>
-          </w:p>
-        </w:tc>
-        <w:tc>
-          <w:tcPr>
-            <w:vAlign w:val="center"/>
-          </w:tcPr>
-          <w:p>
-            <w:pPr>
-              <w:spacing w:line="276"/>
-              <w:jc w:val="center"/>
-            </w:pPr>
-            <w:r>
-              <w:rPr>
-                <w:rFonts w:ascii="Arial" w:cs="Arial" w:eastAsia="Arial" w:hAnsi="Arial"/>
-                <w:b w:val="false"/>
-                <w:bCs w:val="false"/>
-                <w:sz w:val="20"/>
-                <w:szCs w:val="20"/>
-              </w:rPr>
-              <w:t xml:space="preserve">85 %</w:t>
-            </w:r>
-          </w:p>
-        </w:tc>
-        <w:tc>
-          <w:tcPr>
-            <w:vAlign w:val="center"/>
-          </w:tcPr>
-          <w:p>
-            <w:pPr>
-              <w:spacing w:line="276"/>
-              <w:jc w:val="left"/>
-            </w:pPr>
-            <w:r>
-              <w:rPr>
-                <w:rFonts w:ascii="Arial" w:cs="Arial" w:eastAsia="Arial" w:hAnsi="Arial"/>
-                <w:b w:val="false"/>
-                <w:bCs w:val="false"/>
-                <w:sz w:val="20"/>
-                <w:szCs w:val="20"/>
-              </w:rPr>
-              <w:t xml:space="preserve">Aplicado en el servidor; faltan las pruebas de reinicio y nmap</w:t>
+              <w:t xml:space="preserve">7,5</w:t>
+            </w:r>
+          </w:p>
+        </w:tc>
+        <w:tc>
+          <w:tcPr>
+            <w:vAlign w:val="center"/>
+          </w:tcPr>
+          <w:p>
+            <w:pPr>
+              <w:spacing w:line="276"/>
+              <w:jc w:val="center"/>
+            </w:pPr>
+            <w:r>
+              <w:rPr>
+                <w:rFonts w:ascii="Arial" w:cs="Arial" w:eastAsia="Arial" w:hAnsi="Arial"/>
+                <w:b w:val="false"/>
+                <w:bCs w:val="false"/>
+                <w:sz w:val="20"/>
+                <w:szCs w:val="20"/>
+              </w:rPr>
+              <w:t xml:space="preserve">95 %</w:t>
+            </w:r>
+          </w:p>
+        </w:tc>
+        <w:tc>
+          <w:tcPr>
+            <w:vAlign w:val="center"/>
+          </w:tcPr>
+          <w:p>
+            <w:pPr>
+              <w:spacing w:line="276"/>
+              <w:jc w:val="left"/>
+            </w:pPr>
+            <w:r>
+              <w:rPr>
+                <w:rFonts w:ascii="Arial" w:cs="Arial" w:eastAsia="Arial" w:hAnsi="Arial"/>
+                <w:b w:val="false"/>
+                <w:bCs w:val="false"/>
+                <w:sz w:val="20"/>
+                <w:szCs w:val="20"/>
+              </w:rPr>
+              <w:t xml:space="preserve">Aplicado y verificado tras reinicio; falta el escaneo nmap externo</w:t>
             </w:r>
           </w:p>
         </w:tc>
@@ -676,49 +676,49 @@
                 <w:sz w:val="20"/>
                 <w:szCs w:val="20"/>
               </w:rPr>
-              <w:t xml:space="preserve">8</w:t>
-            </w:r>
-          </w:p>
-        </w:tc>
-        <w:tc>
-          <w:tcPr>
-            <w:vAlign w:val="center"/>
-          </w:tcPr>
-          <w:p>
-            <w:pPr>
-              <w:spacing w:line="276"/>
-              <w:jc w:val="center"/>
-            </w:pPr>
-            <w:r>
-              <w:rPr>
-                <w:rFonts w:ascii="Arial" w:cs="Arial" w:eastAsia="Arial" w:hAnsi="Arial"/>
-                <w:b w:val="false"/>
-                <w:bCs w:val="false"/>
-                <w:sz w:val="20"/>
-                <w:szCs w:val="20"/>
-              </w:rPr>
-              <w:t xml:space="preserve">70 %</w:t>
-            </w:r>
-          </w:p>
-        </w:tc>
-        <w:tc>
-          <w:tcPr>
-            <w:vAlign w:val="center"/>
-          </w:tcPr>
-          <w:p>
-            <w:pPr>
-              <w:spacing w:line="276"/>
-              <w:jc w:val="left"/>
-            </w:pPr>
-            <w:r>
-              <w:rPr>
-                <w:rFonts w:ascii="Arial" w:cs="Arial" w:eastAsia="Arial" w:hAnsi="Arial"/>
-                <w:b w:val="false"/>
-                <w:bCs w:val="false"/>
-                <w:sz w:val="20"/>
-                <w:szCs w:val="20"/>
-              </w:rPr>
-              <w:t xml:space="preserve">Instalación probada en local; falta ejecutarla en el servidor</w:t>
+              <w:t xml:space="preserve">12</w:t>
+            </w:r>
+          </w:p>
+        </w:tc>
+        <w:tc>
+          <w:tcPr>
+            <w:vAlign w:val="center"/>
+          </w:tcPr>
+          <w:p>
+            <w:pPr>
+              <w:spacing w:line="276"/>
+              <w:jc w:val="center"/>
+            </w:pPr>
+            <w:r>
+              <w:rPr>
+                <w:rFonts w:ascii="Arial" w:cs="Arial" w:eastAsia="Arial" w:hAnsi="Arial"/>
+                <w:b w:val="false"/>
+                <w:bCs w:val="false"/>
+                <w:sz w:val="20"/>
+                <w:szCs w:val="20"/>
+              </w:rPr>
+              <w:t xml:space="preserve">100 %</w:t>
+            </w:r>
+          </w:p>
+        </w:tc>
+        <w:tc>
+          <w:tcPr>
+            <w:vAlign w:val="center"/>
+          </w:tcPr>
+          <w:p>
+            <w:pPr>
+              <w:spacing w:line="276"/>
+              <w:jc w:val="left"/>
+            </w:pPr>
+            <w:r>
+              <w:rPr>
+                <w:rFonts w:ascii="Arial" w:cs="Arial" w:eastAsia="Arial" w:hAnsi="Arial"/>
+                <w:b w:val="false"/>
+                <w:bCs w:val="false"/>
+                <w:sz w:val="20"/>
+                <w:szCs w:val="20"/>
+              </w:rPr>
+              <w:t xml:space="preserve">Instalado en el servidor y probado desde el exterior por el puerto 22</w:t>
             </w:r>
           </w:p>
         </w:tc>
@@ -783,49 +783,49 @@
                 <w:sz w:val="20"/>
                 <w:szCs w:val="20"/>
               </w:rPr>
-              <w:t xml:space="preserve">0</w:t>
-            </w:r>
-          </w:p>
-        </w:tc>
-        <w:tc>
-          <w:tcPr>
-            <w:vAlign w:val="center"/>
-          </w:tcPr>
-          <w:p>
-            <w:pPr>
-              <w:spacing w:line="276"/>
-              <w:jc w:val="center"/>
-            </w:pPr>
-            <w:r>
-              <w:rPr>
-                <w:rFonts w:ascii="Arial" w:cs="Arial" w:eastAsia="Arial" w:hAnsi="Arial"/>
-                <w:b w:val="false"/>
-                <w:bCs w:val="false"/>
-                <w:sz w:val="20"/>
-                <w:szCs w:val="20"/>
-              </w:rPr>
-              <w:t xml:space="preserve">0 %</w:t>
-            </w:r>
-          </w:p>
-        </w:tc>
-        <w:tc>
-          <w:tcPr>
-            <w:vAlign w:val="center"/>
-          </w:tcPr>
-          <w:p>
-            <w:pPr>
-              <w:spacing w:line="276"/>
-              <w:jc w:val="left"/>
-            </w:pPr>
-            <w:r>
-              <w:rPr>
-                <w:rFonts w:ascii="Arial" w:cs="Arial" w:eastAsia="Arial" w:hAnsi="Arial"/>
-                <w:b w:val="false"/>
-                <w:bCs w:val="false"/>
-                <w:sz w:val="20"/>
-                <w:szCs w:val="20"/>
-              </w:rPr>
-              <w:t xml:space="preserve">Pendiente del despliegue</w:t>
+              <w:t xml:space="preserve">1</w:t>
+            </w:r>
+          </w:p>
+        </w:tc>
+        <w:tc>
+          <w:tcPr>
+            <w:vAlign w:val="center"/>
+          </w:tcPr>
+          <w:p>
+            <w:pPr>
+              <w:spacing w:line="276"/>
+              <w:jc w:val="center"/>
+            </w:pPr>
+            <w:r>
+              <w:rPr>
+                <w:rFonts w:ascii="Arial" w:cs="Arial" w:eastAsia="Arial" w:hAnsi="Arial"/>
+                <w:b w:val="false"/>
+                <w:bCs w:val="false"/>
+                <w:sz w:val="20"/>
+                <w:szCs w:val="20"/>
+              </w:rPr>
+              <w:t xml:space="preserve">15 %</w:t>
+            </w:r>
+          </w:p>
+        </w:tc>
+        <w:tc>
+          <w:tcPr>
+            <w:vAlign w:val="center"/>
+          </w:tcPr>
+          <w:p>
+            <w:pPr>
+              <w:spacing w:line="276"/>
+              <w:jc w:val="left"/>
+            </w:pPr>
+            <w:r>
+              <w:rPr>
+                <w:rFonts w:ascii="Arial" w:cs="Arial" w:eastAsia="Arial" w:hAnsi="Arial"/>
+                <w:b w:val="false"/>
+                <w:bCs w:val="false"/>
+                <w:sz w:val="20"/>
+                <w:szCs w:val="20"/>
+              </w:rPr>
+              <w:t xml:space="preserve">Iniciada el 4 de octubre (prevista para el 14)</w:t>
             </w:r>
           </w:p>
         </w:tc>
@@ -1146,7 +1146,7 @@
                 <w:sz w:val="20"/>
                 <w:szCs w:val="20"/>
               </w:rPr>
-              <w:t xml:space="preserve">69 páginas de borrador; faltan los capítulos de resultados</w:t>
+              <w:t xml:space="preserve">71 páginas de borrador; faltan los capítulos de resultados</w:t>
             </w:r>
           </w:p>
         </w:tc>
@@ -1214,7 +1214,7 @@
                 <w:sz w:val="20"/>
                 <w:szCs w:val="20"/>
               </w:rPr>
-              <w:t xml:space="preserve">≈ 70</w:t>
+              <w:t xml:space="preserve">≈ 75</w:t>
             </w:r>
           </w:p>
         </w:tc>
@@ -1236,7 +1236,7 @@
                 <w:sz w:val="20"/>
                 <w:szCs w:val="20"/>
               </w:rPr>
-              <w:t xml:space="preserve">≈ 64 %</w:t>
+              <w:t xml:space="preserve">≈ 69 %</w:t>
             </w:r>
           </w:p>
         </w:tc>
@@ -1315,7 +1315,7 @@
       <w:pPr>
         <w:spacing w:after="120" w:line="360"/>
       </w:pPr>
-      <w:hyperlink w:history="1" r:id="rIdopzxsa-d4awgux8uvl0qa">
+      <w:hyperlink w:history="1" r:id="rIdatxsj6ysqhvjrvvbor4u3">
         <w:r>
           <w:rPr>
             <w:rStyle w:val="Hyperlink"/>
@@ -1411,7 +1411,7 @@
           <w:sz w:val="24"/>
           <w:szCs w:val="24"/>
         </w:rPr>
-        <w:t xml:space="preserve">Ubuntu Server 24.04 en Núremberg, con cortafuegos del proveedor y bastionado aplicado con el primer script.</w:t>
+        <w:t xml:space="preserve">Ubuntu Server 24.04 en Núremberg, con cortafuegos del proveedor, bastionado y Cowrie operativo en el puerto 22 desde el 4 de octubre.</w:t>
       </w:r>
     </w:p>
     <w:p>
@@ -1440,7 +1440,7 @@
           <w:sz w:val="24"/>
           <w:szCs w:val="24"/>
         </w:rPr>
-        <w:t xml:space="preserve">memoria con la estructura de Prometeo (69 páginas de borrador), diagramas de arquitectura y de red, desglose RFTP y diagrama de Gantt.</w:t>
+        <w:t xml:space="preserve">memoria con la estructura de Prometeo (71 páginas de borrador), diagramas de arquitectura y de red, desglose RFTP y diagrama de Gantt.</w:t>
       </w:r>
     </w:p>
     <w:p>
@@ -1679,6 +1679,35 @@
           <w:szCs w:val="24"/>
         </w:rPr>
         <w:t xml:space="preserve">en el despliegue real el script se detuvo de forma segura porque la validación de sshd exige un directorio que en Ubuntu 24.04 solo existe con el servicio en marcha. Se corrigió y el bastionado se completó sin riesgo para el acceso.</w:t>
+      </w:r>
+    </w:p>
+    <w:p>
+      <w:pPr>
+        <w:pStyle w:val="ListParagraph"/>
+        <w:numPr>
+          <w:ilvl w:val="0"/>
+          <w:numId w:val="1"/>
+        </w:numPr>
+        <w:spacing w:line="360"/>
+        <w:ind w:left="720" w:hanging="357"/>
+      </w:pPr>
+      <w:r>
+        <w:rPr>
+          <w:rFonts w:ascii="Arial" w:cs="Arial" w:eastAsia="Arial" w:hAnsi="Arial"/>
+          <w:b/>
+          <w:bCs/>
+          <w:sz w:val="24"/>
+          <w:szCs w:val="24"/>
+        </w:rPr>
+        <w:t xml:space="preserve">Cowrie bajo systemd: </w:t>
+      </w:r>
+      <w:r>
+        <w:rPr>
+          <w:rFonts w:ascii="Arial" w:cs="Arial" w:eastAsia="Arial" w:hAnsi="Arial"/>
+          <w:sz w:val="24"/>
+          <w:szCs w:val="24"/>
+        </w:rPr>
+        <w:t xml:space="preserve">el servicio no arrancaba en el servidor (systemd no activa el entorno virtual de Python y el confinamiento impide escribir el fichero PID). Lo detectó la comprobación final del script; se corrigió sin relajar el confinamiento.</w:t>
       </w:r>
     </w:p>
     <w:p>
@@ -1833,51 +1862,7 @@
                 <w:sz w:val="20"/>
                 <w:szCs w:val="20"/>
               </w:rPr>
-              <w:t xml:space="preserve">Instalación de Cowrie en el servidor y exposición del puerto 22 (scripts ya probados)</w:t>
-            </w:r>
-          </w:p>
-        </w:tc>
-      </w:tr>
-      <w:tr>
-        <w:tc>
-          <w:tcPr>
-            <w:vAlign w:val="center"/>
-          </w:tcPr>
-          <w:p>
-            <w:pPr>
-              <w:spacing w:line="276"/>
-              <w:jc w:val="left"/>
-            </w:pPr>
-            <w:r>
-              <w:rPr>
-                <w:rFonts w:ascii="Arial" w:cs="Arial" w:eastAsia="Arial" w:hAnsi="Arial"/>
-                <w:b w:val="false"/>
-                <w:bCs w:val="false"/>
-                <w:sz w:val="20"/>
-                <w:szCs w:val="20"/>
-              </w:rPr>
-              <w:t xml:space="preserve">A continuación</w:t>
-            </w:r>
-          </w:p>
-        </w:tc>
-        <w:tc>
-          <w:tcPr>
-            <w:vAlign w:val="center"/>
-          </w:tcPr>
-          <w:p>
-            <w:pPr>
-              <w:spacing w:line="276"/>
-              <w:jc w:val="left"/>
-            </w:pPr>
-            <w:r>
-              <w:rPr>
-                <w:rFonts w:ascii="Arial" w:cs="Arial" w:eastAsia="Arial" w:hAnsi="Arial"/>
-                <w:b w:val="false"/>
-                <w:bCs w:val="false"/>
-                <w:sz w:val="20"/>
-                <w:szCs w:val="20"/>
-              </w:rPr>
-              <w:t xml:space="preserve">Pruebas en el servidor: reinicio, nmap externo, ataque controlado desde Kali y capturas</w:t>
+              <w:t xml:space="preserve">Escaneo nmap externo y ataque controlado desde Kali, con capturas</w:t>
             </w:r>
           </w:p>
         </w:tc>
@@ -2043,7 +2028,7 @@
           <w:sz w:val="24"/>
           <w:szCs w:val="24"/>
         </w:rPr>
-        <w:t xml:space="preserve">La captura necesita al menos tres semanas. Al poder comenzar en los primeros días de octubre, antes del 14 de octubre previsto, el calendario de las fases posteriores se mantiene con margen.</w:t>
+        <w:t xml:space="preserve">La captura necesita al menos tres semanas. Al haber comenzado el 4 de octubre, diez días antes de lo previsto, el calendario de las fases posteriores se mantiene con margen.</w:t>
       </w:r>
     </w:p>
     <w:sectPr>

</xml_diff>

<commit_message>
Memoria: capítulo de Resultados con los primeros datos reales; informe del hito actualizado
</commit_message>
<xml_diff>
--- a/docs/Informe_seguimiento_hito50_Diego_Perez_Fonterosa.docx
+++ b/docs/Informe_seguimiento_hito50_Diego_Perez_Fonterosa.docx
@@ -121,7 +121,7 @@
           <w:sz w:val="24"/>
           <w:szCs w:val="24"/>
         </w:rPr>
-        <w:t xml:space="preserve">El proyecto ha completado aproximadamente el 69 % del esfuerzo estimado (75 de 109 horas), por encima del 28 % que la planificación preveía para esta fecha. La diferencia se debe a que se adelantaron trabajos de las fases de análisis, informe y memoria mientras se resolvía un bloqueo en la fase de despliegue.</w:t>
+        <w:t xml:space="preserve">El proyecto ha completado aproximadamente el 74 % del esfuerzo estimado (80 de 109 horas), por encima del 28 % que la planificación preveía para esta fecha. La diferencia se debe a que se adelantaron trabajos de las fases de análisis, informe y memoria mientras se resolvía un bloqueo en la fase de despliegue.</w:t>
       </w:r>
     </w:p>
     <w:p>
@@ -569,28 +569,28 @@
                 <w:sz w:val="20"/>
                 <w:szCs w:val="20"/>
               </w:rPr>
-              <w:t xml:space="preserve">7,5</w:t>
-            </w:r>
-          </w:p>
-        </w:tc>
-        <w:tc>
-          <w:tcPr>
-            <w:vAlign w:val="center"/>
-          </w:tcPr>
-          <w:p>
-            <w:pPr>
-              <w:spacing w:line="276"/>
-              <w:jc w:val="center"/>
-            </w:pPr>
-            <w:r>
-              <w:rPr>
-                <w:rFonts w:ascii="Arial" w:cs="Arial" w:eastAsia="Arial" w:hAnsi="Arial"/>
-                <w:b w:val="false"/>
-                <w:bCs w:val="false"/>
-                <w:sz w:val="20"/>
-                <w:szCs w:val="20"/>
-              </w:rPr>
-              <w:t xml:space="preserve">95 %</w:t>
+              <w:t xml:space="preserve">8</w:t>
+            </w:r>
+          </w:p>
+        </w:tc>
+        <w:tc>
+          <w:tcPr>
+            <w:vAlign w:val="center"/>
+          </w:tcPr>
+          <w:p>
+            <w:pPr>
+              <w:spacing w:line="276"/>
+              <w:jc w:val="center"/>
+            </w:pPr>
+            <w:r>
+              <w:rPr>
+                <w:rFonts w:ascii="Arial" w:cs="Arial" w:eastAsia="Arial" w:hAnsi="Arial"/>
+                <w:b w:val="false"/>
+                <w:bCs w:val="false"/>
+                <w:sz w:val="20"/>
+                <w:szCs w:val="20"/>
+              </w:rPr>
+              <w:t xml:space="preserve">100 %</w:t>
             </w:r>
           </w:p>
         </w:tc>
@@ -611,7 +611,7 @@
                 <w:sz w:val="20"/>
                 <w:szCs w:val="20"/>
               </w:rPr>
-              <w:t xml:space="preserve">Aplicado y verificado tras reinicio; falta el escaneo nmap externo</w:t>
+              <w:t xml:space="preserve">Verificado tras reinicio y con nmap externo</w:t>
             </w:r>
           </w:p>
         </w:tc>
@@ -783,28 +783,28 @@
                 <w:sz w:val="20"/>
                 <w:szCs w:val="20"/>
               </w:rPr>
-              <w:t xml:space="preserve">1</w:t>
-            </w:r>
-          </w:p>
-        </w:tc>
-        <w:tc>
-          <w:tcPr>
-            <w:vAlign w:val="center"/>
-          </w:tcPr>
-          <w:p>
-            <w:pPr>
-              <w:spacing w:line="276"/>
-              <w:jc w:val="center"/>
-            </w:pPr>
-            <w:r>
-              <w:rPr>
-                <w:rFonts w:ascii="Arial" w:cs="Arial" w:eastAsia="Arial" w:hAnsi="Arial"/>
-                <w:b w:val="false"/>
-                <w:bCs w:val="false"/>
-                <w:sz w:val="20"/>
-                <w:szCs w:val="20"/>
-              </w:rPr>
-              <w:t xml:space="preserve">15 %</w:t>
+              <w:t xml:space="preserve">1,5</w:t>
+            </w:r>
+          </w:p>
+        </w:tc>
+        <w:tc>
+          <w:tcPr>
+            <w:vAlign w:val="center"/>
+          </w:tcPr>
+          <w:p>
+            <w:pPr>
+              <w:spacing w:line="276"/>
+              <w:jc w:val="center"/>
+            </w:pPr>
+            <w:r>
+              <w:rPr>
+                <w:rFonts w:ascii="Arial" w:cs="Arial" w:eastAsia="Arial" w:hAnsi="Arial"/>
+                <w:b w:val="false"/>
+                <w:bCs w:val="false"/>
+                <w:sz w:val="20"/>
+                <w:szCs w:val="20"/>
+              </w:rPr>
+              <w:t xml:space="preserve">25 %</w:t>
             </w:r>
           </w:p>
         </w:tc>
@@ -825,7 +825,7 @@
                 <w:sz w:val="20"/>
                 <w:szCs w:val="20"/>
               </w:rPr>
-              <w:t xml:space="preserve">Iniciada el 4 de octubre (prevista para el 14)</w:t>
+              <w:t xml:space="preserve">En marcha desde el 4 de octubre (prevista para el 14)</w:t>
             </w:r>
           </w:p>
         </w:tc>
@@ -890,28 +890,28 @@
                 <w:sz w:val="20"/>
                 <w:szCs w:val="20"/>
               </w:rPr>
-              <w:t xml:space="preserve">12</w:t>
-            </w:r>
-          </w:p>
-        </w:tc>
-        <w:tc>
-          <w:tcPr>
-            <w:vAlign w:val="center"/>
-          </w:tcPr>
-          <w:p>
-            <w:pPr>
-              <w:spacing w:line="276"/>
-              <w:jc w:val="center"/>
-            </w:pPr>
-            <w:r>
-              <w:rPr>
-                <w:rFonts w:ascii="Arial" w:cs="Arial" w:eastAsia="Arial" w:hAnsi="Arial"/>
-                <w:b w:val="false"/>
-                <w:bCs w:val="false"/>
-                <w:sz w:val="20"/>
-                <w:szCs w:val="20"/>
-              </w:rPr>
-              <w:t xml:space="preserve">65 %</w:t>
+              <w:t xml:space="preserve">14</w:t>
+            </w:r>
+          </w:p>
+        </w:tc>
+        <w:tc>
+          <w:tcPr>
+            <w:vAlign w:val="center"/>
+          </w:tcPr>
+          <w:p>
+            <w:pPr>
+              <w:spacing w:line="276"/>
+              <w:jc w:val="center"/>
+            </w:pPr>
+            <w:r>
+              <w:rPr>
+                <w:rFonts w:ascii="Arial" w:cs="Arial" w:eastAsia="Arial" w:hAnsi="Arial"/>
+                <w:b w:val="false"/>
+                <w:bCs w:val="false"/>
+                <w:sz w:val="20"/>
+                <w:szCs w:val="20"/>
+              </w:rPr>
+              <w:t xml:space="preserve">78 %</w:t>
             </w:r>
           </w:p>
         </w:tc>
@@ -932,7 +932,7 @@
                 <w:sz w:val="20"/>
                 <w:szCs w:val="20"/>
               </w:rPr>
-              <w:t xml:space="preserve">Analizador y clasificación MITRE terminados; faltan datos reales</w:t>
+              <w:t xml:space="preserve">Primer análisis de datos reales hecho; falta el del periodo completo</w:t>
             </w:r>
           </w:p>
         </w:tc>
@@ -1104,28 +1104,28 @@
                 <w:sz w:val="20"/>
                 <w:szCs w:val="20"/>
               </w:rPr>
-              <w:t xml:space="preserve">14</w:t>
-            </w:r>
-          </w:p>
-        </w:tc>
-        <w:tc>
-          <w:tcPr>
-            <w:vAlign w:val="center"/>
-          </w:tcPr>
-          <w:p>
-            <w:pPr>
-              <w:spacing w:line="276"/>
-              <w:jc w:val="center"/>
-            </w:pPr>
-            <w:r>
-              <w:rPr>
-                <w:rFonts w:ascii="Arial" w:cs="Arial" w:eastAsia="Arial" w:hAnsi="Arial"/>
-                <w:b w:val="false"/>
-                <w:bCs w:val="false"/>
-                <w:sz w:val="20"/>
-                <w:szCs w:val="20"/>
-              </w:rPr>
-              <w:t xml:space="preserve">55 %</w:t>
+              <w:t xml:space="preserve">16</w:t>
+            </w:r>
+          </w:p>
+        </w:tc>
+        <w:tc>
+          <w:tcPr>
+            <w:vAlign w:val="center"/>
+          </w:tcPr>
+          <w:p>
+            <w:pPr>
+              <w:spacing w:line="276"/>
+              <w:jc w:val="center"/>
+            </w:pPr>
+            <w:r>
+              <w:rPr>
+                <w:rFonts w:ascii="Arial" w:cs="Arial" w:eastAsia="Arial" w:hAnsi="Arial"/>
+                <w:b w:val="false"/>
+                <w:bCs w:val="false"/>
+                <w:sz w:val="20"/>
+                <w:szCs w:val="20"/>
+              </w:rPr>
+              <w:t xml:space="preserve">64 %</w:t>
             </w:r>
           </w:p>
         </w:tc>
@@ -1146,7 +1146,7 @@
                 <w:sz w:val="20"/>
                 <w:szCs w:val="20"/>
               </w:rPr>
-              <w:t xml:space="preserve">71 páginas de borrador; faltan los capítulos de resultados</w:t>
+              <w:t xml:space="preserve">79 páginas; capítulo de resultados con los primeros datos</w:t>
             </w:r>
           </w:p>
         </w:tc>
@@ -1214,7 +1214,7 @@
                 <w:sz w:val="20"/>
                 <w:szCs w:val="20"/>
               </w:rPr>
-              <w:t xml:space="preserve">≈ 75</w:t>
+              <w:t xml:space="preserve">≈ 80</w:t>
             </w:r>
           </w:p>
         </w:tc>
@@ -1236,7 +1236,7 @@
                 <w:sz w:val="20"/>
                 <w:szCs w:val="20"/>
               </w:rPr>
-              <w:t xml:space="preserve">≈ 69 %</w:t>
+              <w:t xml:space="preserve">≈ 74 %</w:t>
             </w:r>
           </w:p>
         </w:tc>
@@ -1315,7 +1315,7 @@
       <w:pPr>
         <w:spacing w:after="120" w:line="360"/>
       </w:pPr>
-      <w:hyperlink w:history="1" r:id="rIdatxsj6ysqhvjrvvbor4u3">
+      <w:hyperlink w:history="1" r:id="rIdpg9r_hio9dvmsarowozjy">
         <w:r>
           <w:rPr>
             <w:rStyle w:val="Hyperlink"/>
@@ -1591,7 +1591,22 @@
           <w:sz w:val="24"/>
           <w:szCs w:val="24"/>
         </w:rPr>
-        <w:t xml:space="preserve">5. Hallazgos Técnicos Relevantes</w:t>
+        <w:t xml:space="preserve">5. Primeros Resultados (4–7 de octubre)</w:t>
+      </w:r>
+    </w:p>
+    <w:p>
+      <w:pPr>
+        <w:spacing w:after="0" w:line="360"/>
+        <w:ind w:firstLine="709"/>
+        <w:jc w:val="left"/>
+      </w:pPr>
+      <w:r>
+        <w:rPr>
+          <w:rFonts w:ascii="Arial" w:cs="Arial" w:eastAsia="Arial" w:hAnsi="Arial"/>
+          <w:sz w:val="24"/>
+          <w:szCs w:val="24"/>
+        </w:rPr>
+        <w:t xml:space="preserve">En los tres primeros días el honeypot registró 13 761 conexiones desde 499 IPs, 12 748 intentos de autenticación, 2 657 comandos y 17 ficheros distintos. El primer ataque llegó 8 minutos después de exponer el puerto 22. Los hallazgos principales son:</w:t>
       </w:r>
     </w:p>
     <w:p>
@@ -1612,15 +1627,15 @@
           <w:sz w:val="24"/>
           <w:szCs w:val="24"/>
         </w:rPr>
-        <w:t xml:space="preserve">Fallo silencioso en Cowrie 3.1.0: </w:t>
-      </w:r>
-      <w:r>
-        <w:rPr>
-          <w:rFonts w:ascii="Arial" w:cs="Arial" w:eastAsia="Arial" w:hAnsi="Arial"/>
-          <w:sz w:val="24"/>
-          <w:szCs w:val="24"/>
-        </w:rPr>
-        <w:t xml:space="preserve">un carácter con tilde en el fichero de credenciales hace que Cowrie rechace todos los accesos sin mostrar ningún error al arrancar. Desplegado así, se habrían perdido todos los comandos de los atacantes. Se detectó en pruebas, se corrigió y el script de instalación lo comprueba ahora antes de continuar.</w:t>
+        <w:t xml:space="preserve">Actividad automatizada: </w:t>
+      </w:r>
+      <w:r>
+        <w:rPr>
+          <w:rFonts w:ascii="Arial" w:cs="Arial" w:eastAsia="Arial" w:hAnsi="Arial"/>
+          <w:sz w:val="24"/>
+          <w:szCs w:val="24"/>
+        </w:rPr>
+        <w:t xml:space="preserve">el primer comando llega 0,7 s después de entrar y el 85 % de los clientes son bibliotecas de programación (SSH-2.0-Go).</w:t>
       </w:r>
     </w:p>
     <w:p>
@@ -1641,15 +1656,15 @@
           <w:sz w:val="24"/>
           <w:szCs w:val="24"/>
         </w:rPr>
-        <w:t xml:space="preserve">iptables en lugar de UFW: </w:t>
-      </w:r>
-      <w:r>
-        <w:rPr>
-          <w:rFonts w:ascii="Arial" w:cs="Arial" w:eastAsia="Arial" w:hAnsi="Arial"/>
-          <w:sz w:val="24"/>
-          <w:szCs w:val="24"/>
-        </w:rPr>
-        <w:t xml:space="preserve">UFW no permite crear la redirección de puertos con sus comandos, y dos herramientas sobre las mismas reglas generan conflictos. En el servidor real, al instalar iptables-persistent el sistema desinstaló UFW automáticamente por ser incompatibles.</w:t>
+        <w:t xml:space="preserve">Fuerza bruta distribuida: </w:t>
+      </w:r>
+      <w:r>
+        <w:rPr>
+          <w:rFonts w:ascii="Arial" w:cs="Arial" w:eastAsia="Arial" w:hAnsi="Arial"/>
+          <w:sz w:val="24"/>
+          <w:szCs w:val="24"/>
+        </w:rPr>
+        <w:t xml:space="preserve">15 IPs de un mismo proveedor en Países Bajos generan el 62 % de las conexiones, con más de 8 000 credenciales distintas.</w:t>
       </w:r>
     </w:p>
     <w:p>
@@ -1670,15 +1685,15 @@
           <w:sz w:val="24"/>
           <w:szCs w:val="24"/>
         </w:rPr>
-        <w:t xml:space="preserve">Validación de sshd en Ubuntu 24.04: </w:t>
-      </w:r>
-      <w:r>
-        <w:rPr>
-          <w:rFonts w:ascii="Arial" w:cs="Arial" w:eastAsia="Arial" w:hAnsi="Arial"/>
-          <w:sz w:val="24"/>
-          <w:szCs w:val="24"/>
-        </w:rPr>
-        <w:t xml:space="preserve">en el despliegue real el script se detuvo de forma segura porque la validación de sshd exige un directorio que en Ubuntu 24.04 solo existe con el servicio en marcha. Se corrigió y el bastionado se completó sin riesgo para el acceso.</w:t>
+        <w:t xml:space="preserve">Campañas conocidas: </w:t>
+      </w:r>
+      <w:r>
+        <w:rPr>
+          <w:rFonts w:ascii="Arial" w:cs="Arial" w:eastAsia="Arial" w:hAnsi="Arial"/>
+          <w:sz w:val="24"/>
+          <w:szCs w:val="24"/>
+        </w:rPr>
+        <w:t xml:space="preserve">la botnet Outlaw (97 IPs instalan su clave SSH «mdrfckr») y el minero RedTail (binarios para cinco arquitecturas).</w:t>
       </w:r>
     </w:p>
     <w:p>
@@ -1699,15 +1714,47 @@
           <w:sz w:val="24"/>
           <w:szCs w:val="24"/>
         </w:rPr>
-        <w:t xml:space="preserve">Cowrie bajo systemd: </w:t>
-      </w:r>
-      <w:r>
-        <w:rPr>
-          <w:rFonts w:ascii="Arial" w:cs="Arial" w:eastAsia="Arial" w:hAnsi="Arial"/>
-          <w:sz w:val="24"/>
-          <w:szCs w:val="24"/>
-        </w:rPr>
-        <w:t xml:space="preserve">el servicio no arrancaba en el servidor (systemd no activa el entorno virtual de Python y el confinamiento impide escribir el fichero PID). Lo detectó la comprobación final del script; se corrigió sin relajar el confinamiento.</w:t>
+        <w:t xml:space="preserve">MITRE ATT&amp;CK: </w:t>
+      </w:r>
+      <w:r>
+        <w:rPr>
+          <w:rFonts w:ascii="Arial" w:cs="Arial" w:eastAsia="Arial" w:hAnsi="Arial"/>
+          <w:sz w:val="24"/>
+          <w:szCs w:val="24"/>
+        </w:rPr>
+        <w:t xml:space="preserve">21 técnicas en 9 tácticas, entre ellas bots que comprueban si están en un honeypot (T1497.001) y el uso del servidor como proxy (T1090).</w:t>
+      </w:r>
+    </w:p>
+    <w:p>
+      <w:pPr>
+        <w:spacing w:after="0" w:line="360"/>
+        <w:ind w:firstLine="709"/>
+        <w:jc w:val="left"/>
+      </w:pPr>
+      <w:r>
+        <w:rPr>
+          <w:rFonts w:ascii="Arial" w:cs="Arial" w:eastAsia="Arial" w:hAnsi="Arial"/>
+          <w:sz w:val="24"/>
+          <w:szCs w:val="24"/>
+        </w:rPr>
+        <w:t xml:space="preserve">El escaneo con nmap confirmó que solo son visibles los puertos 22 (Cowrie, identificado como Debian 12) y 2022, y que el cortafuegos del proveedor está aplicado. Los datos reales sirvieron además para corregir y ampliar el clasificador (de 33 a 50 pruebas automáticas).</w:t>
+      </w:r>
+    </w:p>
+    <w:p>
+      <w:pPr>
+        <w:pStyle w:val="Heading1"/>
+        <w:spacing w:after="120" w:before="240" w:line="360"/>
+      </w:pPr>
+      <w:r>
+        <w:rPr>
+          <w:rFonts w:ascii="Arial" w:cs="Arial" w:eastAsia="Arial" w:hAnsi="Arial"/>
+          <w:b/>
+          <w:bCs/>
+          <w:color w:val="000000"/>
+          <w:sz w:val="24"/>
+          <w:szCs w:val="24"/>
+        </w:rPr>
+        <w:t xml:space="preserve">6. Hallazgos Técnicos Relevantes</w:t>
       </w:r>
     </w:p>
     <w:p>
@@ -1728,6 +1775,122 @@
           <w:sz w:val="24"/>
           <w:szCs w:val="24"/>
         </w:rPr>
+        <w:t xml:space="preserve">Fallo silencioso en Cowrie 3.1.0: </w:t>
+      </w:r>
+      <w:r>
+        <w:rPr>
+          <w:rFonts w:ascii="Arial" w:cs="Arial" w:eastAsia="Arial" w:hAnsi="Arial"/>
+          <w:sz w:val="24"/>
+          <w:szCs w:val="24"/>
+        </w:rPr>
+        <w:t xml:space="preserve">un carácter con tilde en el fichero de credenciales hace que Cowrie rechace todos los accesos sin mostrar ningún error al arrancar. Desplegado así, se habrían perdido todos los comandos de los atacantes. Se detectó en pruebas, se corrigió y el script de instalación lo comprueba ahora antes de continuar.</w:t>
+      </w:r>
+    </w:p>
+    <w:p>
+      <w:pPr>
+        <w:pStyle w:val="ListParagraph"/>
+        <w:numPr>
+          <w:ilvl w:val="0"/>
+          <w:numId w:val="1"/>
+        </w:numPr>
+        <w:spacing w:line="360"/>
+        <w:ind w:left="720" w:hanging="357"/>
+      </w:pPr>
+      <w:r>
+        <w:rPr>
+          <w:rFonts w:ascii="Arial" w:cs="Arial" w:eastAsia="Arial" w:hAnsi="Arial"/>
+          <w:b/>
+          <w:bCs/>
+          <w:sz w:val="24"/>
+          <w:szCs w:val="24"/>
+        </w:rPr>
+        <w:t xml:space="preserve">iptables en lugar de UFW: </w:t>
+      </w:r>
+      <w:r>
+        <w:rPr>
+          <w:rFonts w:ascii="Arial" w:cs="Arial" w:eastAsia="Arial" w:hAnsi="Arial"/>
+          <w:sz w:val="24"/>
+          <w:szCs w:val="24"/>
+        </w:rPr>
+        <w:t xml:space="preserve">UFW no permite crear la redirección de puertos con sus comandos, y dos herramientas sobre las mismas reglas generan conflictos. En el servidor real, al instalar iptables-persistent el sistema desinstaló UFW automáticamente por ser incompatibles.</w:t>
+      </w:r>
+    </w:p>
+    <w:p>
+      <w:pPr>
+        <w:pStyle w:val="ListParagraph"/>
+        <w:numPr>
+          <w:ilvl w:val="0"/>
+          <w:numId w:val="1"/>
+        </w:numPr>
+        <w:spacing w:line="360"/>
+        <w:ind w:left="720" w:hanging="357"/>
+      </w:pPr>
+      <w:r>
+        <w:rPr>
+          <w:rFonts w:ascii="Arial" w:cs="Arial" w:eastAsia="Arial" w:hAnsi="Arial"/>
+          <w:b/>
+          <w:bCs/>
+          <w:sz w:val="24"/>
+          <w:szCs w:val="24"/>
+        </w:rPr>
+        <w:t xml:space="preserve">Validación de sshd en Ubuntu 24.04: </w:t>
+      </w:r>
+      <w:r>
+        <w:rPr>
+          <w:rFonts w:ascii="Arial" w:cs="Arial" w:eastAsia="Arial" w:hAnsi="Arial"/>
+          <w:sz w:val="24"/>
+          <w:szCs w:val="24"/>
+        </w:rPr>
+        <w:t xml:space="preserve">en el despliegue real el script se detuvo de forma segura porque la validación de sshd exige un directorio que en Ubuntu 24.04 solo existe con el servicio en marcha. Se corrigió y el bastionado se completó sin riesgo para el acceso.</w:t>
+      </w:r>
+    </w:p>
+    <w:p>
+      <w:pPr>
+        <w:pStyle w:val="ListParagraph"/>
+        <w:numPr>
+          <w:ilvl w:val="0"/>
+          <w:numId w:val="1"/>
+        </w:numPr>
+        <w:spacing w:line="360"/>
+        <w:ind w:left="720" w:hanging="357"/>
+      </w:pPr>
+      <w:r>
+        <w:rPr>
+          <w:rFonts w:ascii="Arial" w:cs="Arial" w:eastAsia="Arial" w:hAnsi="Arial"/>
+          <w:b/>
+          <w:bCs/>
+          <w:sz w:val="24"/>
+          <w:szCs w:val="24"/>
+        </w:rPr>
+        <w:t xml:space="preserve">Cowrie bajo systemd: </w:t>
+      </w:r>
+      <w:r>
+        <w:rPr>
+          <w:rFonts w:ascii="Arial" w:cs="Arial" w:eastAsia="Arial" w:hAnsi="Arial"/>
+          <w:sz w:val="24"/>
+          <w:szCs w:val="24"/>
+        </w:rPr>
+        <w:t xml:space="preserve">el servicio no arrancaba en el servidor (systemd no activa el entorno virtual de Python y el confinamiento impide escribir el fichero PID). Lo detectó la comprobación final del script; se corrigió sin relajar el confinamiento.</w:t>
+      </w:r>
+    </w:p>
+    <w:p>
+      <w:pPr>
+        <w:pStyle w:val="ListParagraph"/>
+        <w:numPr>
+          <w:ilvl w:val="0"/>
+          <w:numId w:val="1"/>
+        </w:numPr>
+        <w:spacing w:line="360"/>
+        <w:ind w:left="720" w:hanging="357"/>
+      </w:pPr>
+      <w:r>
+        <w:rPr>
+          <w:rFonts w:ascii="Arial" w:cs="Arial" w:eastAsia="Arial" w:hAnsi="Arial"/>
+          <w:b/>
+          <w:bCs/>
+          <w:sz w:val="24"/>
+          <w:szCs w:val="24"/>
+        </w:rPr>
         <w:t xml:space="preserve">Corrección del mapeo MITRE: </w:t>
       </w:r>
       <w:r>
@@ -1753,7 +1916,7 @@
           <w:sz w:val="24"/>
           <w:szCs w:val="24"/>
         </w:rPr>
-        <w:t xml:space="preserve">6. Plan Revisado y Riesgos</w:t>
+        <w:t xml:space="preserve">7. Plan Revisado y Riesgos</w:t>
       </w:r>
     </w:p>
     <w:tbl>
@@ -1841,7 +2004,7 @@
                 <w:sz w:val="20"/>
                 <w:szCs w:val="20"/>
               </w:rPr>
-              <w:t xml:space="preserve">Próximos días</w:t>
+              <w:t xml:space="preserve">Próximas semanas</w:t>
             </w:r>
           </w:p>
         </w:tc>
@@ -1862,7 +2025,7 @@
                 <w:sz w:val="20"/>
                 <w:szCs w:val="20"/>
               </w:rPr>
-              <w:t xml:space="preserve">Escaneo nmap externo y ataque controlado desde Kali, con capturas</w:t>
+              <w:t xml:space="preserve">Ataque controlado desde Kali y descargas semanales de logs con análisis parciales</w:t>
             </w:r>
           </w:p>
         </w:tc>
@@ -1885,7 +2048,7 @@
                 <w:sz w:val="20"/>
                 <w:szCs w:val="20"/>
               </w:rPr>
-              <w:t xml:space="preserve">≥ 3 semanas de captura</w:t>
+              <w:t xml:space="preserve">Finales de octubre</w:t>
             </w:r>
           </w:p>
         </w:tc>
@@ -1906,51 +2069,7 @@
                 <w:sz w:val="20"/>
                 <w:szCs w:val="20"/>
               </w:rPr>
-              <w:t xml:space="preserve">Descargas periódicas de logs y análisis parciales con el analizador</w:t>
-            </w:r>
-          </w:p>
-        </w:tc>
-      </w:tr>
-      <w:tr>
-        <w:tc>
-          <w:tcPr>
-            <w:vAlign w:val="center"/>
-          </w:tcPr>
-          <w:p>
-            <w:pPr>
-              <w:spacing w:line="276"/>
-              <w:jc w:val="left"/>
-            </w:pPr>
-            <w:r>
-              <w:rPr>
-                <w:rFonts w:ascii="Arial" w:cs="Arial" w:eastAsia="Arial" w:hAnsi="Arial"/>
-                <w:b w:val="false"/>
-                <w:bCs w:val="false"/>
-                <w:sz w:val="20"/>
-                <w:szCs w:val="20"/>
-              </w:rPr>
-              <w:t xml:space="preserve">Tras la captura</w:t>
-            </w:r>
-          </w:p>
-        </w:tc>
-        <w:tc>
-          <w:tcPr>
-            <w:vAlign w:val="center"/>
-          </w:tcPr>
-          <w:p>
-            <w:pPr>
-              <w:spacing w:line="276"/>
-              <w:jc w:val="left"/>
-            </w:pPr>
-            <w:r>
-              <w:rPr>
-                <w:rFonts w:ascii="Arial" w:cs="Arial" w:eastAsia="Arial" w:hAnsi="Arial"/>
-                <w:b w:val="false"/>
-                <w:bCs w:val="false"/>
-                <w:sz w:val="20"/>
-                <w:szCs w:val="20"/>
-              </w:rPr>
-              <w:t xml:space="preserve">Análisis final, informe CTI y capítulos de resultados de la memoria</w:t>
+              <w:t xml:space="preserve">Fin de la captura; análisis final, informe CTI y cierre de la memoria</w:t>
             </w:r>
           </w:p>
         </w:tc>

</xml_diff>

<commit_message>
Primera entrega parcial: módulos profesionales, objetivos específicos y evolución respecto al anteproyecto
</commit_message>
<xml_diff>
--- a/docs/Informe_seguimiento_hito50_Diego_Perez_Fonterosa.docx
+++ b/docs/Informe_seguimiento_hito50_Diego_Perez_Fonterosa.docx
@@ -1146,7 +1146,7 @@
                 <w:sz w:val="20"/>
                 <w:szCs w:val="20"/>
               </w:rPr>
-              <w:t xml:space="preserve">79 páginas; capítulo de resultados con los primeros datos</w:t>
+              <w:t xml:space="preserve">82 páginas; capítulo de resultados con los primeros datos</w:t>
             </w:r>
           </w:p>
         </w:tc>
@@ -1315,7 +1315,7 @@
       <w:pPr>
         <w:spacing w:after="120" w:line="360"/>
       </w:pPr>
-      <w:hyperlink w:history="1" r:id="rIdpg9r_hio9dvmsarowozjy">
+      <w:hyperlink w:history="1" r:id="rIdu2_xiqxhoteghorecun8c">
         <w:r>
           <w:rPr>
             <w:rStyle w:val="Hyperlink"/>
@@ -1440,7 +1440,7 @@
           <w:sz w:val="24"/>
           <w:szCs w:val="24"/>
         </w:rPr>
-        <w:t xml:space="preserve">memoria con la estructura de Prometeo (71 páginas de borrador), diagramas de arquitectura y de red, desglose RFTP y diagrama de Gantt.</w:t>
+        <w:t xml:space="preserve">memoria con la estructura de Prometeo (82 páginas de borrador), diagramas de arquitectura y de red, desglose RFTP y diagrama de Gantt.</w:t>
       </w:r>
     </w:p>
     <w:p>

</xml_diff>

<commit_message>
Primera entrega parcial corregida: portada, arquitectura x86, estado de componentes, Wazuh y valoración personal
</commit_message>
<xml_diff>
--- a/docs/Informe_seguimiento_hito50_Diego_Perez_Fonterosa.docx
+++ b/docs/Informe_seguimiento_hito50_Diego_Perez_Fonterosa.docx
@@ -1146,7 +1146,7 @@
                 <w:sz w:val="20"/>
                 <w:szCs w:val="20"/>
               </w:rPr>
-              <w:t xml:space="preserve">82 páginas; capítulo de resultados con los primeros datos</w:t>
+              <w:t xml:space="preserve">85 páginas; capítulo de resultados con los primeros datos</w:t>
             </w:r>
           </w:p>
         </w:tc>
@@ -1315,7 +1315,7 @@
       <w:pPr>
         <w:spacing w:after="120" w:line="360"/>
       </w:pPr>
-      <w:hyperlink w:history="1" r:id="rIdu2_xiqxhoteghorecun8c">
+      <w:hyperlink w:history="1" r:id="rIdrpkyoxnuzn8lewavn45l3">
         <w:r>
           <w:rPr>
             <w:rStyle w:val="Hyperlink"/>
@@ -1440,7 +1440,7 @@
           <w:sz w:val="24"/>
           <w:szCs w:val="24"/>
         </w:rPr>
-        <w:t xml:space="preserve">memoria con la estructura de Prometeo (82 páginas de borrador), diagramas de arquitectura y de red, desglose RFTP y diagrama de Gantt.</w:t>
+        <w:t xml:space="preserve">memoria con la estructura de Prometeo (85 páginas de borrador), diagramas de arquitectura y de red, desglose RFTP y diagrama de Gantt.</w:t>
       </w:r>
     </w:p>
     <w:p>

</xml_diff>